<commit_message>
docs: modified Phase 1 SRS draft and re-generated architecture figures all good to merge
</commit_message>
<xml_diff>
--- a/Phase 1 SRS docs/FYP Phase 1 Draft-2.docx
+++ b/Phase 1 SRS docs/FYP Phase 1 Draft-2.docx
@@ -5507,7 +5507,7 @@
       <w:r>
         <w:drawing>
           <wp:inline xmlns:a="http://schemas.openxmlformats.org/drawingml/2006/main" xmlns:pic="http://schemas.openxmlformats.org/drawingml/2006/picture">
-            <wp:extent cx="5486400" cy="2718033"/>
+            <wp:extent cx="5760720" cy="3264408"/>
             <wp:docPr id="1" name="Picture 1"/>
             <wp:cNvGraphicFramePr>
               <a:graphicFrameLocks noChangeAspect="1"/>
@@ -5528,7 +5528,7 @@
                   <pic:spPr>
                     <a:xfrm>
                       <a:off x="0" y="0"/>
-                      <a:ext cx="5486400" cy="2718033"/>
+                      <a:ext cx="5760720" cy="3264408"/>
                     </a:xfrm>
                     <a:prstGeom prst="rect"/>
                   </pic:spPr>
@@ -5643,7 +5643,7 @@
       <w:r>
         <w:drawing>
           <wp:inline xmlns:a="http://schemas.openxmlformats.org/drawingml/2006/main" xmlns:pic="http://schemas.openxmlformats.org/drawingml/2006/picture">
-            <wp:extent cx="5669280" cy="2713949"/>
+            <wp:extent cx="5760720" cy="3441469"/>
             <wp:docPr id="1" name="Picture 1"/>
             <wp:cNvGraphicFramePr>
               <a:graphicFrameLocks noChangeAspect="1"/>
@@ -5664,7 +5664,7 @@
                   <pic:spPr>
                     <a:xfrm>
                       <a:off x="0" y="0"/>
-                      <a:ext cx="5669280" cy="2713949"/>
+                      <a:ext cx="5760720" cy="3441469"/>
                     </a:xfrm>
                     <a:prstGeom prst="rect"/>
                   </pic:spPr>
@@ -5957,7 +5957,7 @@
       <w:r>
         <w:drawing>
           <wp:inline xmlns:a="http://schemas.openxmlformats.org/drawingml/2006/main" xmlns:pic="http://schemas.openxmlformats.org/drawingml/2006/picture">
-            <wp:extent cx="5486400" cy="2827279"/>
+            <wp:extent cx="5303520" cy="2733037"/>
             <wp:docPr id="1" name="Picture 1"/>
             <wp:cNvGraphicFramePr>
               <a:graphicFrameLocks noChangeAspect="1"/>
@@ -5978,7 +5978,7 @@
                   <pic:spPr>
                     <a:xfrm>
                       <a:off x="0" y="0"/>
-                      <a:ext cx="5486400" cy="2827279"/>
+                      <a:ext cx="5303520" cy="2733037"/>
                     </a:xfrm>
                     <a:prstGeom prst="rect"/>
                   </pic:spPr>
@@ -6012,7 +6012,7 @@
       <w:r>
         <w:drawing>
           <wp:inline xmlns:a="http://schemas.openxmlformats.org/drawingml/2006/main" xmlns:pic="http://schemas.openxmlformats.org/drawingml/2006/picture">
-            <wp:extent cx="4754880" cy="3360366"/>
+            <wp:extent cx="4572000" cy="3231121"/>
             <wp:docPr id="1" name="Picture 1"/>
             <wp:cNvGraphicFramePr>
               <a:graphicFrameLocks noChangeAspect="1"/>
@@ -6033,7 +6033,7 @@
                   <pic:spPr>
                     <a:xfrm>
                       <a:off x="0" y="0"/>
-                      <a:ext cx="4754880" cy="3360366"/>
+                      <a:ext cx="4572000" cy="3231121"/>
                     </a:xfrm>
                     <a:prstGeom prst="rect"/>
                   </pic:spPr>
@@ -7883,7 +7883,7 @@
       <w:r>
         <w:drawing>
           <wp:inline xmlns:a="http://schemas.openxmlformats.org/drawingml/2006/main" xmlns:pic="http://schemas.openxmlformats.org/drawingml/2006/picture">
-            <wp:extent cx="5486400" cy="2567031"/>
+            <wp:extent cx="5760720" cy="3516284"/>
             <wp:docPr id="1" name="Picture 1"/>
             <wp:cNvGraphicFramePr>
               <a:graphicFrameLocks noChangeAspect="1"/>
@@ -7904,7 +7904,7 @@
                   <pic:spPr>
                     <a:xfrm>
                       <a:off x="0" y="0"/>
-                      <a:ext cx="5486400" cy="2567031"/>
+                      <a:ext cx="5760720" cy="3516284"/>
                     </a:xfrm>
                     <a:prstGeom prst="rect"/>
                   </pic:spPr>
@@ -7927,7 +7927,7 @@
           <w:color w:val="1E293B"/>
           <w:sz w:val="21"/>
         </w:rPr>
-        <w:t>Figure 6: Baseline Operational Health — K3s Cluster Status Showing Operator, Aggregation Server, and 4 Distributed Client Pods.</w:t>
+        <w:t>Figure 6: Distributed Healthcare Node Topology &amp; K3s Multi-Node Enclave Architecture Across Regional Facilities.</w:t>
       </w:r>
     </w:p>
     <w:p>
@@ -8283,7 +8283,7 @@
       <w:r>
         <w:drawing>
           <wp:inline xmlns:a="http://schemas.openxmlformats.org/drawingml/2006/main" xmlns:pic="http://schemas.openxmlformats.org/drawingml/2006/picture">
-            <wp:extent cx="5852160" cy="2916870"/>
+            <wp:extent cx="5852160" cy="3221976"/>
             <wp:docPr id="1" name="Picture 1"/>
             <wp:cNvGraphicFramePr>
               <a:graphicFrameLocks noChangeAspect="1"/>
@@ -8304,7 +8304,7 @@
                   <pic:spPr>
                     <a:xfrm>
                       <a:off x="0" y="0"/>
-                      <a:ext cx="5852160" cy="2916870"/>
+                      <a:ext cx="5852160" cy="3221976"/>
                     </a:xfrm>
                     <a:prstGeom prst="rect"/>
                   </pic:spPr>
@@ -8943,61 +8943,6 @@
         </w:rPr>
       </w:pPr>
       <w:r/>
-    </w:p>
-    <w:p>
-      <w:pPr>
-        <w:spacing w:before="240" w:after="80"/>
-        <w:jc w:val="center"/>
-      </w:pPr>
-      <w:r>
-        <w:drawing>
-          <wp:inline xmlns:a="http://schemas.openxmlformats.org/drawingml/2006/main" xmlns:pic="http://schemas.openxmlformats.org/drawingml/2006/picture">
-            <wp:extent cx="5120640" cy="3277593"/>
-            <wp:docPr id="1" name="Picture 1"/>
-            <wp:cNvGraphicFramePr>
-              <a:graphicFrameLocks noChangeAspect="1"/>
-            </wp:cNvGraphicFramePr>
-            <a:graphic>
-              <a:graphicData uri="http://schemas.openxmlformats.org/drawingml/2006/picture">
-                <pic:pic>
-                  <pic:nvPicPr>
-                    <pic:cNvPr id="0" name="Market_Segmentation_Pyramid.png"/>
-                    <pic:cNvPicPr/>
-                  </pic:nvPicPr>
-                  <pic:blipFill>
-                    <a:blip r:embed="rId9"/>
-                    <a:stretch>
-                      <a:fillRect/>
-                    </a:stretch>
-                  </pic:blipFill>
-                  <pic:spPr>
-                    <a:xfrm>
-                      <a:off x="0" y="0"/>
-                      <a:ext cx="5120640" cy="3277593"/>
-                    </a:xfrm>
-                    <a:prstGeom prst="rect"/>
-                  </pic:spPr>
-                </pic:pic>
-              </a:graphicData>
-            </a:graphic>
-          </wp:inline>
-        </w:drawing>
-      </w:r>
-    </w:p>
-    <w:p>
-      <w:pPr>
-        <w:spacing w:before="120" w:after="240"/>
-        <w:jc w:val="center"/>
-      </w:pPr>
-      <w:r>
-        <w:rPr>
-          <w:rFonts w:ascii="Times New Roman" w:hAnsi="Times New Roman"/>
-          <w:i/>
-          <w:color w:val="1E293B"/>
-          <w:sz w:val="21"/>
-        </w:rPr>
-        <w:t>Figure 3: Market Segmentation Pyramid (TAM, SAM, SOM) for Privacy-Preserving Healthcare AI.</w:t>
-      </w:r>
     </w:p>
     <w:p>
       <w:pPr>
@@ -12450,7 +12395,7 @@
       <w:r>
         <w:drawing>
           <wp:inline xmlns:a="http://schemas.openxmlformats.org/drawingml/2006/main" xmlns:pic="http://schemas.openxmlformats.org/drawingml/2006/picture">
-            <wp:extent cx="5669280" cy="2906102"/>
+            <wp:extent cx="5760720" cy="3067396"/>
             <wp:docPr id="1" name="Picture 1"/>
             <wp:cNvGraphicFramePr>
               <a:graphicFrameLocks noChangeAspect="1"/>
@@ -12471,7 +12416,7 @@
                   <pic:spPr>
                     <a:xfrm>
                       <a:off x="0" y="0"/>
-                      <a:ext cx="5669280" cy="2906102"/>
+                      <a:ext cx="5760720" cy="3067396"/>
                     </a:xfrm>
                     <a:prstGeom prst="rect"/>
                   </pic:spPr>
@@ -26365,7 +26310,7 @@
       <w:r>
         <w:drawing>
           <wp:inline xmlns:a="http://schemas.openxmlformats.org/drawingml/2006/main" xmlns:pic="http://schemas.openxmlformats.org/drawingml/2006/picture">
-            <wp:extent cx="5760720" cy="3527883"/>
+            <wp:extent cx="5852160" cy="3876106"/>
             <wp:docPr id="1" name="Picture 1"/>
             <wp:cNvGraphicFramePr>
               <a:graphicFrameLocks noChangeAspect="1"/>
@@ -26386,7 +26331,7 @@
                   <pic:spPr>
                     <a:xfrm>
                       <a:off x="0" y="0"/>
-                      <a:ext cx="5760720" cy="3527883"/>
+                      <a:ext cx="5852160" cy="3876106"/>
                     </a:xfrm>
                     <a:prstGeom prst="rect"/>
                   </pic:spPr>

</xml_diff>

<commit_message>
modified figure 2,6 and 10
</commit_message>
<xml_diff>
--- a/Phase 1 SRS docs/FYP Phase 1 Draft-2.docx
+++ b/Phase 1 SRS docs/FYP Phase 1 Draft-2.docx
@@ -6547,14 +6547,27 @@
       <w:r>
         <w:t xml:space="preserve">Figure </w:t>
       </w:r>
-      <w:fldSimple w:instr=" SEQ Figure \* ARABIC ">
-        <w:r>
-          <w:rPr>
-            <w:noProof/>
-          </w:rPr>
-          <w:t>1</w:t>
-        </w:r>
-      </w:fldSimple>
+      <w:r>
+        <w:fldChar w:fldCharType="begin"/>
+      </w:r>
+      <w:r>
+        <w:instrText xml:space="preserve"> SEQ Figure \* ARABIC </w:instrText>
+      </w:r>
+      <w:r>
+        <w:fldChar w:fldCharType="separate"/>
+      </w:r>
+      <w:r>
+        <w:rPr>
+          <w:noProof/>
+        </w:rPr>
+        <w:t>1</w:t>
+      </w:r>
+      <w:r>
+        <w:rPr>
+          <w:noProof/>
+        </w:rPr>
+        <w:fldChar w:fldCharType="end"/>
+      </w:r>
       <w:r>
         <w:rPr>
           <w:rFonts w:ascii="Times New Roman" w:hAnsi="Times New Roman"/>
@@ -6880,14 +6893,27 @@
       <w:r>
         <w:t xml:space="preserve">Figure </w:t>
       </w:r>
-      <w:fldSimple w:instr=" SEQ Figure \* ARABIC ">
-        <w:r>
-          <w:rPr>
-            <w:noProof/>
-          </w:rPr>
-          <w:t>2</w:t>
-        </w:r>
-      </w:fldSimple>
+      <w:r>
+        <w:fldChar w:fldCharType="begin"/>
+      </w:r>
+      <w:r>
+        <w:instrText xml:space="preserve"> SEQ Figure \* ARABIC </w:instrText>
+      </w:r>
+      <w:r>
+        <w:fldChar w:fldCharType="separate"/>
+      </w:r>
+      <w:r>
+        <w:rPr>
+          <w:noProof/>
+        </w:rPr>
+        <w:t>2</w:t>
+      </w:r>
+      <w:r>
+        <w:rPr>
+          <w:noProof/>
+        </w:rPr>
+        <w:fldChar w:fldCharType="end"/>
+      </w:r>
       <w:r>
         <w:rPr>
           <w:rFonts w:ascii="Times New Roman" w:hAnsi="Times New Roman"/>
@@ -6895,16 +6921,7 @@
           <w:color w:val="1E293B"/>
           <w:sz w:val="21"/>
         </w:rPr>
-        <w:t xml:space="preserve">: </w:t>
-      </w:r>
-      <w:r>
-        <w:rPr>
-          <w:rFonts w:ascii="Times New Roman" w:hAnsi="Times New Roman"/>
-          <w:i/>
-          <w:color w:val="1E293B"/>
-          <w:sz w:val="21"/>
-        </w:rPr>
-        <w:t>Privacy Comparison</w:t>
+        <w:t>: Privacy Comparison</w:t>
       </w:r>
       <w:bookmarkEnd w:id="23"/>
     </w:p>
@@ -7386,17 +7403,31 @@
       <w:r>
         <w:t xml:space="preserve">Figure </w:t>
       </w:r>
-      <w:fldSimple w:instr=" SEQ Figure \* ARABIC ">
-        <w:r>
-          <w:rPr>
-            <w:noProof/>
-          </w:rPr>
-          <w:t>3</w:t>
-        </w:r>
-      </w:fldSimple>
+      <w:r>
+        <w:fldChar w:fldCharType="begin"/>
+      </w:r>
+      <w:r>
+        <w:instrText xml:space="preserve"> SEQ Figure \* ARABIC </w:instrText>
+      </w:r>
+      <w:r>
+        <w:fldChar w:fldCharType="separate"/>
+      </w:r>
+      <w:r>
+        <w:rPr>
+          <w:noProof/>
+        </w:rPr>
+        <w:t>3</w:t>
+      </w:r>
+      <w:r>
+        <w:rPr>
+          <w:noProof/>
+        </w:rPr>
+        <w:fldChar w:fldCharType="end"/>
+      </w:r>
       <w:r>
         <w:rPr>
           <w:rStyle w:val="FigureChar"/>
+          <w:noProof/>
         </w:rPr>
         <w:drawing>
           <wp:anchor distT="0" distB="0" distL="114300" distR="114300" simplePos="0" relativeHeight="251662848" behindDoc="0" locked="0" layoutInCell="1" allowOverlap="1" wp14:anchorId="685A0891" wp14:editId="391AFA63">
@@ -7462,25 +7493,7 @@
           <w:color w:val="1E293B"/>
           <w:sz w:val="21"/>
         </w:rPr>
-        <w:t>: Identified Inf</w:t>
-      </w:r>
-      <w:r>
-        <w:rPr>
-          <w:rFonts w:ascii="Times New Roman" w:hAnsi="Times New Roman"/>
-          <w:i/>
-          <w:color w:val="1E293B"/>
-          <w:sz w:val="21"/>
-        </w:rPr>
-        <w:t>rastructure Gaps in Healthcare</w:t>
-      </w:r>
-      <w:r>
-        <w:rPr>
-          <w:rFonts w:ascii="Times New Roman" w:hAnsi="Times New Roman"/>
-          <w:i/>
-          <w:color w:val="1E293B"/>
-          <w:sz w:val="21"/>
-        </w:rPr>
-        <w:t>).</w:t>
+        <w:t>: Identified Infrastructure Gaps in Healthcare).</w:t>
       </w:r>
       <w:bookmarkEnd w:id="25"/>
     </w:p>
@@ -7600,14 +7613,27 @@
       <w:r>
         <w:t xml:space="preserve">Figure </w:t>
       </w:r>
-      <w:fldSimple w:instr=" SEQ Figure \* ARABIC ">
-        <w:r>
-          <w:rPr>
-            <w:noProof/>
-          </w:rPr>
-          <w:t>4</w:t>
-        </w:r>
-      </w:fldSimple>
+      <w:r>
+        <w:fldChar w:fldCharType="begin"/>
+      </w:r>
+      <w:r>
+        <w:instrText xml:space="preserve"> SEQ Figure \* ARABIC </w:instrText>
+      </w:r>
+      <w:r>
+        <w:fldChar w:fldCharType="separate"/>
+      </w:r>
+      <w:r>
+        <w:rPr>
+          <w:noProof/>
+        </w:rPr>
+        <w:t>4</w:t>
+      </w:r>
+      <w:r>
+        <w:rPr>
+          <w:noProof/>
+        </w:rPr>
+        <w:fldChar w:fldCharType="end"/>
+      </w:r>
       <w:r>
         <w:rPr>
           <w:rFonts w:ascii="Times New Roman" w:hAnsi="Times New Roman"/>
@@ -8120,6 +8146,7 @@
         <w:rPr>
           <w:rFonts w:ascii="Times New Roman" w:hAnsi="Times New Roman"/>
           <w:i/>
+          <w:noProof/>
           <w:color w:val="1E293B"/>
           <w:sz w:val="21"/>
         </w:rPr>
@@ -8133,18 +8160,18 @@
           <w:sz w:val="21"/>
         </w:rPr>
         <w:drawing>
-          <wp:anchor distT="0" distB="0" distL="114300" distR="114300" simplePos="0" relativeHeight="251664896" behindDoc="0" locked="0" layoutInCell="1" allowOverlap="1" wp14:anchorId="44E1E42C" wp14:editId="681EBBAD">
+          <wp:anchor distT="0" distB="0" distL="114300" distR="114300" simplePos="0" relativeHeight="251673088" behindDoc="0" locked="0" layoutInCell="1" allowOverlap="1" wp14:anchorId="24CF4BFB" wp14:editId="54C9D8A3">
             <wp:simplePos x="0" y="0"/>
             <wp:positionH relativeFrom="margin">
               <wp:align>center</wp:align>
             </wp:positionH>
             <wp:positionV relativeFrom="paragraph">
-              <wp:posOffset>235158</wp:posOffset>
+              <wp:posOffset>243205</wp:posOffset>
             </wp:positionV>
-            <wp:extent cx="6745296" cy="3309582"/>
-            <wp:effectExtent l="0" t="0" r="0" b="5715"/>
+            <wp:extent cx="5848350" cy="3495675"/>
+            <wp:effectExtent l="0" t="0" r="0" b="9525"/>
             <wp:wrapNone/>
-            <wp:docPr id="19" name="Picture 19"/>
+            <wp:docPr id="6" name="Picture 6"/>
             <wp:cNvGraphicFramePr>
               <a:graphicFrameLocks xmlns:a="http://schemas.openxmlformats.org/drawingml/2006/main" noChangeAspect="1"/>
             </wp:cNvGraphicFramePr>
@@ -8152,7 +8179,7 @@
               <a:graphicData uri="http://schemas.openxmlformats.org/drawingml/2006/picture">
                 <pic:pic xmlns:pic="http://schemas.openxmlformats.org/drawingml/2006/picture">
                   <pic:nvPicPr>
-                    <pic:cNvPr id="0" name="Picture 6"/>
+                    <pic:cNvPr id="0" name="Picture 4"/>
                     <pic:cNvPicPr>
                       <a:picLocks noChangeAspect="1" noChangeArrowheads="1"/>
                     </pic:cNvPicPr>
@@ -8165,13 +8192,13 @@
                         </a:ext>
                       </a:extLst>
                     </a:blip>
-                    <a:srcRect l="2243" t="15412" r="2246" b="7890"/>
+                    <a:srcRect l="2031" t="15894" r="2031" b="3091"/>
                     <a:stretch/>
                   </pic:blipFill>
                   <pic:spPr bwMode="auto">
                     <a:xfrm>
                       <a:off x="0" y="0"/>
-                      <a:ext cx="6745296" cy="3309582"/>
+                      <a:ext cx="5848350" cy="3495675"/>
                     </a:xfrm>
                     <a:prstGeom prst="rect">
                       <a:avLst/>
@@ -8218,6 +8245,18 @@
         <w:rPr>
           <w:rFonts w:ascii="Times New Roman" w:hAnsi="Times New Roman"/>
           <w:i/>
+          <w:color w:val="1E293B"/>
+          <w:sz w:val="21"/>
+        </w:rPr>
+      </w:pPr>
+    </w:p>
+    <w:p>
+      <w:pPr>
+        <w:spacing w:before="120" w:after="240"/>
+        <w:jc w:val="center"/>
+        <w:rPr>
+          <w:rFonts w:ascii="Times New Roman" w:hAnsi="Times New Roman"/>
+          <w:i/>
           <w:noProof/>
           <w:color w:val="1E293B"/>
           <w:sz w:val="21"/>
@@ -8287,7 +8326,6 @@
     <w:p>
       <w:pPr>
         <w:spacing w:before="120" w:after="240"/>
-        <w:jc w:val="center"/>
         <w:rPr>
           <w:rFonts w:ascii="Times New Roman" w:hAnsi="Times New Roman"/>
           <w:i/>
@@ -8298,8 +8336,7 @@
     </w:p>
     <w:p>
       <w:pPr>
-        <w:spacing w:before="120" w:after="240"/>
-        <w:jc w:val="center"/>
+        <w:pStyle w:val="Caption"/>
         <w:rPr>
           <w:rFonts w:ascii="Times New Roman" w:hAnsi="Times New Roman"/>
           <w:i/>
@@ -8307,46 +8344,39 @@
           <w:sz w:val="21"/>
         </w:rPr>
       </w:pPr>
-    </w:p>
-    <w:p>
-      <w:pPr>
-        <w:pStyle w:val="Caption"/>
+      <w:bookmarkStart w:id="29" w:name="_Toc244199114"/>
+      <w:r>
+        <w:t xml:space="preserve">Figure </w:t>
+      </w:r>
+      <w:r>
+        <w:fldChar w:fldCharType="begin"/>
+      </w:r>
+      <w:r>
+        <w:instrText xml:space="preserve"> SEQ Figure \* ARABIC </w:instrText>
+      </w:r>
+      <w:r>
+        <w:fldChar w:fldCharType="separate"/>
+      </w:r>
+      <w:r>
+        <w:rPr>
+          <w:noProof/>
+        </w:rPr>
+        <w:t>5</w:t>
+      </w:r>
+      <w:r>
+        <w:rPr>
+          <w:noProof/>
+        </w:rPr>
+        <w:fldChar w:fldCharType="end"/>
+      </w:r>
+      <w:r>
         <w:rPr>
           <w:rFonts w:ascii="Times New Roman" w:hAnsi="Times New Roman"/>
           <w:i/>
           <w:color w:val="1E293B"/>
           <w:sz w:val="21"/>
         </w:rPr>
-      </w:pPr>
-      <w:bookmarkStart w:id="29" w:name="_Toc244199114"/>
-      <w:r>
-        <w:t xml:space="preserve">Figure </w:t>
-      </w:r>
-      <w:fldSimple w:instr=" SEQ Figure \* ARABIC ">
-        <w:r>
-          <w:rPr>
-            <w:noProof/>
-          </w:rPr>
-          <w:t>5</w:t>
-        </w:r>
-      </w:fldSimple>
-      <w:r>
-        <w:rPr>
-          <w:rFonts w:ascii="Times New Roman" w:hAnsi="Times New Roman"/>
-          <w:i/>
-          <w:color w:val="1E293B"/>
-          <w:sz w:val="21"/>
-        </w:rPr>
-        <w:t>: Distributed Hea</w:t>
-      </w:r>
-      <w:r>
-        <w:rPr>
-          <w:rFonts w:ascii="Times New Roman" w:hAnsi="Times New Roman"/>
-          <w:i/>
-          <w:color w:val="1E293B"/>
-          <w:sz w:val="21"/>
-        </w:rPr>
-        <w:t>lthcare Node Topology &amp; K3s Multi-Node</w:t>
+        <w:t>: Distributed Healthcare Node Topology &amp; K3s Multi-Node</w:t>
       </w:r>
       <w:bookmarkEnd w:id="29"/>
     </w:p>
@@ -8376,24 +8406,42 @@
           <w:szCs w:val="24"/>
         </w:rPr>
       </w:pPr>
-      <w:r>
+    </w:p>
+    <w:p>
+      <w:pPr>
+        <w:jc w:val="both"/>
+        <w:rPr>
+          <w:rFonts w:ascii="Times New Roman" w:hAnsi="Times New Roman"/>
+          <w:color w:val="0D0D0D" w:themeColor="text1" w:themeTint="F2"/>
+          <w:szCs w:val="24"/>
+        </w:rPr>
+      </w:pPr>
+    </w:p>
+    <w:p>
+      <w:pPr>
+        <w:spacing w:after="240"/>
+        <w:jc w:val="center"/>
         <w:rPr>
           <w:noProof/>
         </w:rPr>
-        <w:lastRenderedPageBreak/>
+      </w:pPr>
+      <w:r>
+        <w:rPr>
+          <w:noProof/>
+        </w:rPr>
         <w:drawing>
-          <wp:anchor distT="0" distB="0" distL="114300" distR="114300" simplePos="0" relativeHeight="251665920" behindDoc="0" locked="0" layoutInCell="1" allowOverlap="1" wp14:anchorId="7433916F" wp14:editId="782D4CF8">
+          <wp:anchor distT="0" distB="0" distL="114300" distR="114300" simplePos="0" relativeHeight="251672064" behindDoc="0" locked="0" layoutInCell="1" allowOverlap="1" wp14:anchorId="68E0F948" wp14:editId="15BE63B7">
             <wp:simplePos x="0" y="0"/>
-            <wp:positionH relativeFrom="page">
-              <wp:align>right</wp:align>
+            <wp:positionH relativeFrom="margin">
+              <wp:align>center</wp:align>
             </wp:positionH>
             <wp:positionV relativeFrom="paragraph">
-              <wp:posOffset>233234</wp:posOffset>
+              <wp:posOffset>45720</wp:posOffset>
             </wp:positionV>
-            <wp:extent cx="7566368" cy="3397942"/>
-            <wp:effectExtent l="0" t="0" r="0" b="0"/>
+            <wp:extent cx="5772150" cy="3400425"/>
+            <wp:effectExtent l="0" t="0" r="0" b="9525"/>
             <wp:wrapNone/>
-            <wp:docPr id="20" name="Picture 20"/>
+            <wp:docPr id="5" name="Picture 5"/>
             <wp:cNvGraphicFramePr>
               <a:graphicFrameLocks xmlns:a="http://schemas.openxmlformats.org/drawingml/2006/main" noChangeAspect="1"/>
             </wp:cNvGraphicFramePr>
@@ -8401,26 +8449,26 @@
               <a:graphicData uri="http://schemas.openxmlformats.org/drawingml/2006/picture">
                 <pic:pic xmlns:pic="http://schemas.openxmlformats.org/drawingml/2006/picture">
                   <pic:nvPicPr>
-                    <pic:cNvPr id="0" name="Picture 7"/>
+                    <pic:cNvPr id="0" name="Picture 3"/>
                     <pic:cNvPicPr>
                       <a:picLocks noChangeAspect="1" noChangeArrowheads="1"/>
                     </pic:cNvPicPr>
                   </pic:nvPicPr>
                   <pic:blipFill rotWithShape="1">
-                    <a:blip r:embed="rId18">
+                    <a:blip r:embed="rId18" cstate="print">
                       <a:extLst>
                         <a:ext uri="{28A0092B-C50C-407E-A947-70E740481C1C}">
                           <a14:useLocalDpi xmlns:a14="http://schemas.microsoft.com/office/drawing/2010/main" val="0"/>
                         </a:ext>
                       </a:extLst>
                     </a:blip>
-                    <a:srcRect l="1569" t="12221" r="1573" b="8747"/>
+                    <a:srcRect l="2813" t="17881" r="2500" b="3311"/>
                     <a:stretch/>
                   </pic:blipFill>
                   <pic:spPr bwMode="auto">
                     <a:xfrm>
                       <a:off x="0" y="0"/>
-                      <a:ext cx="7566368" cy="3397942"/>
+                      <a:ext cx="5772150" cy="3400425"/>
                     </a:xfrm>
                     <a:prstGeom prst="rect">
                       <a:avLst/>
@@ -8450,16 +8498,6 @@
     </w:p>
     <w:p>
       <w:pPr>
-        <w:jc w:val="both"/>
-        <w:rPr>
-          <w:rFonts w:ascii="Times New Roman" w:hAnsi="Times New Roman"/>
-          <w:color w:val="0D0D0D" w:themeColor="text1" w:themeTint="F2"/>
-          <w:szCs w:val="24"/>
-        </w:rPr>
-      </w:pPr>
-    </w:p>
-    <w:p>
-      <w:pPr>
         <w:spacing w:after="240"/>
         <w:jc w:val="center"/>
         <w:rPr>
@@ -8566,14 +8604,27 @@
       <w:r>
         <w:t xml:space="preserve">Figure </w:t>
       </w:r>
-      <w:fldSimple w:instr=" SEQ Figure \* ARABIC ">
-        <w:r>
-          <w:rPr>
-            <w:noProof/>
-          </w:rPr>
-          <w:t>6</w:t>
-        </w:r>
-      </w:fldSimple>
+      <w:r>
+        <w:fldChar w:fldCharType="begin"/>
+      </w:r>
+      <w:r>
+        <w:instrText xml:space="preserve"> SEQ Figure \* ARABIC </w:instrText>
+      </w:r>
+      <w:r>
+        <w:fldChar w:fldCharType="separate"/>
+      </w:r>
+      <w:r>
+        <w:rPr>
+          <w:noProof/>
+        </w:rPr>
+        <w:t>6</w:t>
+      </w:r>
+      <w:r>
+        <w:rPr>
+          <w:noProof/>
+        </w:rPr>
+        <w:fldChar w:fldCharType="end"/>
+      </w:r>
       <w:r>
         <w:rPr>
           <w:rFonts w:ascii="Times New Roman" w:hAnsi="Times New Roman"/>
@@ -9136,7 +9187,7 @@
           <w:sz w:val="24"/>
           <w:szCs w:val="24"/>
         </w:rPr>
-        <w:t xml:space="preserve"> and healthcare AI roles in Pakistan (July 2026) reveals that 68% of postings explicitly mention Kubernetes, while fewer than 9% mention federated learning, privacy-preserving </w:t>
+        <w:t xml:space="preserve"> and healthcare AI roles in Pakistan (July 2026) reveals that 68% of postings explicitly </w:t>
       </w:r>
       <w:r>
         <w:rPr>
@@ -9146,7 +9197,7 @@
           <w:szCs w:val="24"/>
         </w:rPr>
         <w:lastRenderedPageBreak/>
-        <w:t>ML, or SMPC</w:t>
+        <w:t>mention Kubernetes, while fewer than 9% mention federated learning, privacy-preserving ML, or SMPC</w:t>
       </w:r>
       <w:r>
         <w:rPr>
@@ -9191,13 +9242,13 @@
           <w:noProof/>
         </w:rPr>
         <w:drawing>
-          <wp:anchor distT="0" distB="0" distL="114300" distR="114300" simplePos="0" relativeHeight="251661824" behindDoc="0" locked="0" layoutInCell="1" allowOverlap="1" wp14:anchorId="763E8794" wp14:editId="24866548">
+          <wp:anchor distT="0" distB="0" distL="114300" distR="114300" simplePos="0" relativeHeight="251661824" behindDoc="0" locked="0" layoutInCell="1" allowOverlap="1" wp14:anchorId="763E8794" wp14:editId="3F1896D8">
             <wp:simplePos x="0" y="0"/>
             <wp:positionH relativeFrom="margin">
               <wp:align>right</wp:align>
             </wp:positionH>
             <wp:positionV relativeFrom="paragraph">
-              <wp:posOffset>441532</wp:posOffset>
+              <wp:posOffset>584200</wp:posOffset>
             </wp:positionV>
             <wp:extent cx="6087110" cy="3138805"/>
             <wp:effectExtent l="0" t="0" r="8890" b="4445"/>
@@ -9834,25 +9885,33 @@
           <w:color w:val="0D0D0D" w:themeColor="text1" w:themeTint="F2"/>
           <w:szCs w:val="24"/>
         </w:rPr>
-        <w:t>, Lahore. A software product company with active healthcare AI client engagements in North America and the Middle East. The interview had followed the four-question protocol: (1) What operational barriers prevent FL adoption in production environments? (2) What monitoring and failure-recovery capabilities would a deployment team require? (3) How is model versioning currently handled in distributed training scenarios? (4) How are distributed ML deployments managed across client boundaries in production?</w:t>
-      </w:r>
-    </w:p>
-    <w:p>
-      <w:pPr>
-        <w:spacing w:after="240"/>
+        <w:t xml:space="preserve">, Lahore. A software product company with active healthcare AI client engagements in North America and the Middle East. The interview had followed the four-question protocol: (1) What operational barriers prevent FL adoption in production environments? (2) What monitoring and failure-recovery capabilities would a deployment team require? (3) How is model </w:t>
+      </w:r>
+      <w:r>
         <w:rPr>
           <w:rFonts w:ascii="Times New Roman" w:eastAsia="Calibri" w:hAnsi="Times New Roman"/>
           <w:color w:val="0D0D0D" w:themeColor="text1" w:themeTint="F2"/>
           <w:szCs w:val="24"/>
         </w:rPr>
-      </w:pPr>
-      <w:r>
+        <w:lastRenderedPageBreak/>
+        <w:t>versioning currently handled in distributed training scenarios? (4) How are distributed ML deployments managed across client boundaries in production?</w:t>
+      </w:r>
+    </w:p>
+    <w:p>
+      <w:pPr>
+        <w:spacing w:after="240"/>
         <w:rPr>
           <w:rFonts w:ascii="Times New Roman" w:eastAsia="Calibri" w:hAnsi="Times New Roman"/>
           <w:color w:val="0D0D0D" w:themeColor="text1" w:themeTint="F2"/>
           <w:szCs w:val="24"/>
         </w:rPr>
-        <w:lastRenderedPageBreak/>
+      </w:pPr>
+      <w:r>
+        <w:rPr>
+          <w:rFonts w:ascii="Times New Roman" w:eastAsia="Calibri" w:hAnsi="Times New Roman"/>
+          <w:color w:val="0D0D0D" w:themeColor="text1" w:themeTint="F2"/>
+          <w:szCs w:val="24"/>
+        </w:rPr>
         <w:t>Key Findings:</w:t>
       </w:r>
     </w:p>
@@ -10653,7 +10712,6 @@
           <w:rFonts w:ascii="Times New Roman" w:hAnsi="Times New Roman"/>
           <w:color w:val="0D0D0D" w:themeColor="text1" w:themeTint="F2"/>
         </w:rPr>
-        <w:lastRenderedPageBreak/>
         <w:t>Stakeholders Identification</w:t>
       </w:r>
       <w:bookmarkEnd w:id="32"/>
@@ -12563,40 +12621,22 @@
       <w:bookmarkStart w:id="83" w:name="_Toc237185296"/>
       <w:r>
         <w:rPr>
-          <w:rFonts w:ascii="Times New Roman" w:hAnsi="Times New Roman"/>
-          <w:bCs/>
-          <w:color w:val="0D0D0D" w:themeColor="text1" w:themeTint="F2"/>
+          <w:noProof/>
         </w:rPr>
         <w:lastRenderedPageBreak/>
-        <w:t>Agile Framework Setup</w:t>
-      </w:r>
-      <w:bookmarkEnd w:id="83"/>
-    </w:p>
-    <w:p>
-      <w:pPr>
-        <w:spacing w:before="240" w:after="80"/>
-        <w:jc w:val="center"/>
-        <w:rPr>
-          <w:noProof/>
-        </w:rPr>
-      </w:pPr>
-      <w:r>
-        <w:rPr>
-          <w:noProof/>
-        </w:rPr>
         <w:drawing>
-          <wp:anchor distT="0" distB="0" distL="114300" distR="114300" simplePos="0" relativeHeight="251666944" behindDoc="0" locked="0" layoutInCell="1" allowOverlap="1" wp14:anchorId="4B297897" wp14:editId="2712C912">
+          <wp:anchor distT="0" distB="0" distL="114300" distR="114300" simplePos="0" relativeHeight="251674112" behindDoc="0" locked="0" layoutInCell="1" allowOverlap="1" wp14:anchorId="07EF8FFB" wp14:editId="58D2B6A2">
             <wp:simplePos x="0" y="0"/>
             <wp:positionH relativeFrom="margin">
               <wp:align>center</wp:align>
             </wp:positionH>
             <wp:positionV relativeFrom="paragraph">
-              <wp:posOffset>158750</wp:posOffset>
+              <wp:posOffset>312420</wp:posOffset>
             </wp:positionV>
-            <wp:extent cx="6438917" cy="2552131"/>
-            <wp:effectExtent l="0" t="0" r="0" b="635"/>
+            <wp:extent cx="5791200" cy="3362325"/>
+            <wp:effectExtent l="0" t="0" r="0" b="9525"/>
             <wp:wrapNone/>
-            <wp:docPr id="21" name="Picture 21"/>
+            <wp:docPr id="7" name="Picture 7"/>
             <wp:cNvGraphicFramePr>
               <a:graphicFrameLocks xmlns:a="http://schemas.openxmlformats.org/drawingml/2006/main" noChangeAspect="1"/>
             </wp:cNvGraphicFramePr>
@@ -12604,26 +12644,26 @@
               <a:graphicData uri="http://schemas.openxmlformats.org/drawingml/2006/picture">
                 <pic:pic xmlns:pic="http://schemas.openxmlformats.org/drawingml/2006/picture">
                   <pic:nvPicPr>
-                    <pic:cNvPr id="0" name="Picture 8"/>
+                    <pic:cNvPr id="0" name="Picture 5"/>
                     <pic:cNvPicPr>
                       <a:picLocks noChangeAspect="1" noChangeArrowheads="1"/>
                     </pic:cNvPicPr>
                   </pic:nvPicPr>
                   <pic:blipFill rotWithShape="1">
-                    <a:blip r:embed="rId20">
+                    <a:blip r:embed="rId20" cstate="print">
                       <a:extLst>
                         <a:ext uri="{28A0092B-C50C-407E-A947-70E740481C1C}">
                           <a14:useLocalDpi xmlns:a14="http://schemas.microsoft.com/office/drawing/2010/main" val="0"/>
                         </a:ext>
                       </a:extLst>
                     </a:blip>
-                    <a:srcRect l="2018" t="21265" r="1797" b="19352"/>
+                    <a:srcRect l="2812" t="18101" r="2187" b="3973"/>
                     <a:stretch/>
                   </pic:blipFill>
                   <pic:spPr bwMode="auto">
                     <a:xfrm>
                       <a:off x="0" y="0"/>
-                      <a:ext cx="6438917" cy="2552131"/>
+                      <a:ext cx="5791200" cy="3362325"/>
                     </a:xfrm>
                     <a:prstGeom prst="rect">
                       <a:avLst/>
@@ -12650,6 +12690,24 @@
           </wp:anchor>
         </w:drawing>
       </w:r>
+      <w:r>
+        <w:rPr>
+          <w:rFonts w:ascii="Times New Roman" w:hAnsi="Times New Roman"/>
+          <w:bCs/>
+          <w:color w:val="0D0D0D" w:themeColor="text1" w:themeTint="F2"/>
+        </w:rPr>
+        <w:t>Agile Framework Setup</w:t>
+      </w:r>
+      <w:bookmarkEnd w:id="83"/>
+    </w:p>
+    <w:p>
+      <w:pPr>
+        <w:spacing w:before="240" w:after="80"/>
+        <w:jc w:val="center"/>
+        <w:rPr>
+          <w:noProof/>
+        </w:rPr>
+      </w:pPr>
     </w:p>
     <w:p>
       <w:pPr>
@@ -12716,23 +12774,132 @@
           <w:sz w:val="21"/>
         </w:rPr>
       </w:pPr>
+      <w:r>
+        <w:rPr>
+          <w:rFonts w:ascii="Times New Roman" w:hAnsi="Times New Roman"/>
+          <w:i/>
+          <w:noProof/>
+          <w:color w:val="1E293B"/>
+          <w:sz w:val="21"/>
+        </w:rPr>
+        <mc:AlternateContent>
+          <mc:Choice Requires="wps">
+            <w:drawing>
+              <wp:anchor distT="0" distB="0" distL="114300" distR="114300" simplePos="0" relativeHeight="251675136" behindDoc="0" locked="0" layoutInCell="1" allowOverlap="1" wp14:anchorId="42E63ED1" wp14:editId="498094FA">
+                <wp:simplePos x="0" y="0"/>
+                <wp:positionH relativeFrom="column">
+                  <wp:posOffset>535304</wp:posOffset>
+                </wp:positionH>
+                <wp:positionV relativeFrom="paragraph">
+                  <wp:posOffset>274955</wp:posOffset>
+                </wp:positionV>
+                <wp:extent cx="1266825" cy="409575"/>
+                <wp:effectExtent l="0" t="0" r="9525" b="9525"/>
+                <wp:wrapNone/>
+                <wp:docPr id="8" name="Rectangle 8"/>
+                <wp:cNvGraphicFramePr/>
+                <a:graphic xmlns:a="http://schemas.openxmlformats.org/drawingml/2006/main">
+                  <a:graphicData uri="http://schemas.microsoft.com/office/word/2010/wordprocessingShape">
+                    <wps:wsp>
+                      <wps:cNvSpPr/>
+                      <wps:spPr>
+                        <a:xfrm>
+                          <a:off x="0" y="0"/>
+                          <a:ext cx="1266825" cy="409575"/>
+                        </a:xfrm>
+                        <a:prstGeom prst="rect">
+                          <a:avLst/>
+                        </a:prstGeom>
+                        <a:solidFill>
+                          <a:srgbClr val="0E192C"/>
+                        </a:solidFill>
+                        <a:ln>
+                          <a:noFill/>
+                        </a:ln>
+                      </wps:spPr>
+                      <wps:style>
+                        <a:lnRef idx="2">
+                          <a:schemeClr val="accent1">
+                            <a:shade val="50000"/>
+                          </a:schemeClr>
+                        </a:lnRef>
+                        <a:fillRef idx="1">
+                          <a:schemeClr val="accent1"/>
+                        </a:fillRef>
+                        <a:effectRef idx="0">
+                          <a:schemeClr val="accent1"/>
+                        </a:effectRef>
+                        <a:fontRef idx="minor">
+                          <a:schemeClr val="lt1"/>
+                        </a:fontRef>
+                      </wps:style>
+                      <wps:bodyPr rot="0" spcFirstLastPara="0" vertOverflow="overflow" horzOverflow="overflow" vert="horz" wrap="square" lIns="91440" tIns="45720" rIns="91440" bIns="45720" numCol="1" spcCol="0" rtlCol="0" fromWordArt="0" anchor="ctr" anchorCtr="0" forceAA="0" compatLnSpc="1">
+                        <a:prstTxWarp prst="textNoShape">
+                          <a:avLst/>
+                        </a:prstTxWarp>
+                        <a:noAutofit/>
+                      </wps:bodyPr>
+                    </wps:wsp>
+                  </a:graphicData>
+                </a:graphic>
+                <wp14:sizeRelH relativeFrom="margin">
+                  <wp14:pctWidth>0</wp14:pctWidth>
+                </wp14:sizeRelH>
+                <wp14:sizeRelV relativeFrom="margin">
+                  <wp14:pctHeight>0</wp14:pctHeight>
+                </wp14:sizeRelV>
+              </wp:anchor>
+            </w:drawing>
+          </mc:Choice>
+          <mc:Fallback>
+            <w:pict>
+              <v:rect w14:anchorId="179F3F8D" id="Rectangle 8" o:spid="_x0000_s1026" style="position:absolute;margin-left:42.15pt;margin-top:21.65pt;width:99.75pt;height:32.25pt;z-index:251675136;visibility:visible;mso-wrap-style:square;mso-width-percent:0;mso-height-percent:0;mso-wrap-distance-left:9pt;mso-wrap-distance-top:0;mso-wrap-distance-right:9pt;mso-wrap-distance-bottom:0;mso-position-horizontal:absolute;mso-position-horizontal-relative:text;mso-position-vertical:absolute;mso-position-vertical-relative:text;mso-width-percent:0;mso-height-percent:0;mso-width-relative:margin;mso-height-relative:margin;v-text-anchor:middle" o:gfxdata="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" fillcolor="#0e192c" stroked="f" strokeweight="1pt"/>
+            </w:pict>
+          </mc:Fallback>
+        </mc:AlternateContent>
+      </w:r>
     </w:p>
     <w:p>
       <w:pPr>
+        <w:spacing w:before="120" w:after="240"/>
+        <w:jc w:val="center"/>
+        <w:rPr>
+          <w:rFonts w:ascii="Times New Roman" w:hAnsi="Times New Roman"/>
+          <w:i/>
+          <w:color w:val="1E293B"/>
+          <w:sz w:val="21"/>
+        </w:rPr>
+      </w:pPr>
+    </w:p>
+    <w:p>
+      <w:pPr>
         <w:pStyle w:val="Caption"/>
       </w:pPr>
       <w:bookmarkStart w:id="84" w:name="_Toc244199116"/>
       <w:r>
         <w:t xml:space="preserve">Figure </w:t>
       </w:r>
-      <w:fldSimple w:instr=" SEQ Figure \* ARABIC ">
-        <w:r>
-          <w:rPr>
-            <w:noProof/>
-          </w:rPr>
-          <w:t>7</w:t>
-        </w:r>
-      </w:fldSimple>
+      <w:r>
+        <w:fldChar w:fldCharType="begin"/>
+      </w:r>
+      <w:r>
+        <w:instrText xml:space="preserve"> SEQ Figure \* ARABIC </w:instrText>
+      </w:r>
+      <w:r>
+        <w:fldChar w:fldCharType="separate"/>
+      </w:r>
+      <w:r>
+        <w:rPr>
+          <w:noProof/>
+        </w:rPr>
+        <w:t>7</w:t>
+      </w:r>
+      <w:r>
+        <w:rPr>
+          <w:noProof/>
+        </w:rPr>
+        <w:fldChar w:fldCharType="end"/>
+      </w:r>
       <w:r>
         <w:rPr>
           <w:rFonts w:ascii="Times New Roman" w:hAnsi="Times New Roman"/>
@@ -13780,6 +13947,7 @@
                 <w:bCs/>
                 <w:color w:val="0D0D0D" w:themeColor="text1" w:themeTint="F2"/>
               </w:rPr>
+              <w:lastRenderedPageBreak/>
               <w:t>Epic ID</w:t>
             </w:r>
           </w:p>
@@ -13882,7 +14050,6 @@
                 <w:rFonts w:ascii="Times New Roman" w:hAnsi="Times New Roman"/>
                 <w:color w:val="0D0D0D" w:themeColor="text1" w:themeTint="F2"/>
               </w:rPr>
-              <w:lastRenderedPageBreak/>
               <w:t>EP-01</w:t>
             </w:r>
           </w:p>
@@ -16162,6 +16329,7 @@
               <w:rPr>
                 <w:rFonts w:ascii="Times New Roman" w:hAnsi="Times New Roman"/>
               </w:rPr>
+              <w:lastRenderedPageBreak/>
               <w:t>PB-06</w:t>
             </w:r>
           </w:p>
@@ -16269,7 +16437,6 @@
               <w:rPr>
                 <w:rFonts w:ascii="Times New Roman" w:hAnsi="Times New Roman"/>
               </w:rPr>
-              <w:lastRenderedPageBreak/>
               <w:t>PB-07</w:t>
             </w:r>
           </w:p>
@@ -18563,6 +18730,7 @@
               <w:rPr>
                 <w:rFonts w:ascii="Times New Roman" w:hAnsi="Times New Roman"/>
               </w:rPr>
+              <w:lastRenderedPageBreak/>
               <w:t>US-03</w:t>
             </w:r>
           </w:p>
@@ -18720,7 +18888,6 @@
               <w:rPr>
                 <w:rFonts w:ascii="Times New Roman" w:hAnsi="Times New Roman"/>
               </w:rPr>
-              <w:lastRenderedPageBreak/>
               <w:t>US-04</w:t>
             </w:r>
           </w:p>
@@ -20990,6 +21157,7 @@
               <w:rPr>
                 <w:rFonts w:ascii="Times New Roman" w:hAnsi="Times New Roman"/>
               </w:rPr>
+              <w:lastRenderedPageBreak/>
               <w:t>US-19</w:t>
             </w:r>
           </w:p>
@@ -21127,7 +21295,6 @@
               <w:rPr>
                 <w:rFonts w:ascii="Times New Roman" w:hAnsi="Times New Roman"/>
               </w:rPr>
-              <w:lastRenderedPageBreak/>
               <w:t>US-20</w:t>
             </w:r>
           </w:p>
@@ -23427,6 +23594,7 @@
               <w:rPr>
                 <w:rFonts w:ascii="Times New Roman" w:hAnsi="Times New Roman"/>
               </w:rPr>
+              <w:lastRenderedPageBreak/>
               <w:t>US-13</w:t>
             </w:r>
           </w:p>
@@ -23551,7 +23719,6 @@
               <w:rPr>
                 <w:rFonts w:ascii="Times New Roman" w:hAnsi="Times New Roman"/>
               </w:rPr>
-              <w:lastRenderedPageBreak/>
               <w:t>US-14</w:t>
             </w:r>
           </w:p>
@@ -25756,6 +25923,7 @@
               <w:rPr>
                 <w:rFonts w:ascii="Times New Roman" w:hAnsi="Times New Roman"/>
               </w:rPr>
+              <w:lastRenderedPageBreak/>
               <w:t>Sprint 15</w:t>
             </w:r>
           </w:p>
@@ -25845,7 +26013,6 @@
               <w:rPr>
                 <w:rFonts w:ascii="Times New Roman" w:hAnsi="Times New Roman"/>
               </w:rPr>
-              <w:lastRenderedPageBreak/>
               <w:t>Sprint 16</w:t>
             </w:r>
           </w:p>
@@ -26597,14 +26764,27 @@
       <w:r>
         <w:t xml:space="preserve">Figure </w:t>
       </w:r>
-      <w:fldSimple w:instr=" SEQ Figure \* ARABIC ">
-        <w:r>
-          <w:rPr>
-            <w:noProof/>
-          </w:rPr>
-          <w:t>8</w:t>
-        </w:r>
-      </w:fldSimple>
+      <w:r>
+        <w:fldChar w:fldCharType="begin"/>
+      </w:r>
+      <w:r>
+        <w:instrText xml:space="preserve"> SEQ Figure \* ARABIC </w:instrText>
+      </w:r>
+      <w:r>
+        <w:fldChar w:fldCharType="separate"/>
+      </w:r>
+      <w:r>
+        <w:rPr>
+          <w:noProof/>
+        </w:rPr>
+        <w:t>8</w:t>
+      </w:r>
+      <w:r>
+        <w:rPr>
+          <w:noProof/>
+        </w:rPr>
+        <w:fldChar w:fldCharType="end"/>
+      </w:r>
       <w:r>
         <w:rPr>
           <w:rFonts w:ascii="Times New Roman" w:hAnsi="Times New Roman"/>
@@ -26665,6 +26845,7 @@
                 <w:color w:val="0D0D0D" w:themeColor="text1" w:themeTint="F2"/>
                 <w:szCs w:val="24"/>
               </w:rPr>
+              <w:lastRenderedPageBreak/>
               <w:t>Use Case ID</w:t>
             </w:r>
           </w:p>
@@ -26828,7 +27009,6 @@
               <w:rPr>
                 <w:rFonts w:ascii="Times New Roman" w:hAnsi="Times New Roman"/>
               </w:rPr>
-              <w:lastRenderedPageBreak/>
               <w:t>UC-01</w:t>
             </w:r>
           </w:p>
@@ -29952,6 +30132,7 @@
               <w:rPr>
                 <w:rFonts w:ascii="Times New Roman" w:hAnsi="Times New Roman"/>
               </w:rPr>
+              <w:lastRenderedPageBreak/>
               <w:t>UC-24</w:t>
             </w:r>
           </w:p>
@@ -30080,7 +30261,6 @@
               <w:rPr>
                 <w:rFonts w:ascii="Times New Roman" w:hAnsi="Times New Roman"/>
               </w:rPr>
-              <w:lastRenderedPageBreak/>
               <w:t>UC-25</w:t>
             </w:r>
           </w:p>
@@ -32215,14 +32395,27 @@
       <w:r>
         <w:t xml:space="preserve">Figure </w:t>
       </w:r>
-      <w:fldSimple w:instr=" SEQ Figure \* ARABIC ">
-        <w:r>
-          <w:rPr>
-            <w:noProof/>
-          </w:rPr>
-          <w:t>9</w:t>
-        </w:r>
-      </w:fldSimple>
+      <w:r>
+        <w:fldChar w:fldCharType="begin"/>
+      </w:r>
+      <w:r>
+        <w:instrText xml:space="preserve"> SEQ Figure \* ARABIC </w:instrText>
+      </w:r>
+      <w:r>
+        <w:fldChar w:fldCharType="separate"/>
+      </w:r>
+      <w:r>
+        <w:rPr>
+          <w:noProof/>
+        </w:rPr>
+        <w:t>9</w:t>
+      </w:r>
+      <w:r>
+        <w:rPr>
+          <w:noProof/>
+        </w:rPr>
+        <w:fldChar w:fldCharType="end"/>
+      </w:r>
       <w:r>
         <w:rPr>
           <w:rFonts w:ascii="Times New Roman" w:hAnsi="Times New Roman"/>
@@ -37582,14 +37775,27 @@
       <w:r>
         <w:t xml:space="preserve">Figure </w:t>
       </w:r>
-      <w:fldSimple w:instr=" SEQ Figure \* ARABIC ">
-        <w:r>
-          <w:rPr>
-            <w:noProof/>
-          </w:rPr>
-          <w:t>10</w:t>
-        </w:r>
-      </w:fldSimple>
+      <w:r>
+        <w:fldChar w:fldCharType="begin"/>
+      </w:r>
+      <w:r>
+        <w:instrText xml:space="preserve"> SEQ Figure \* ARABIC </w:instrText>
+      </w:r>
+      <w:r>
+        <w:fldChar w:fldCharType="separate"/>
+      </w:r>
+      <w:r>
+        <w:rPr>
+          <w:noProof/>
+        </w:rPr>
+        <w:t>10</w:t>
+      </w:r>
+      <w:r>
+        <w:rPr>
+          <w:noProof/>
+        </w:rPr>
+        <w:fldChar w:fldCharType="end"/>
+      </w:r>
       <w:r>
         <w:rPr>
           <w:rFonts w:ascii="Times New Roman" w:hAnsi="Times New Roman"/>

</xml_diff>